<commit_message>
Add copyright protection and author attribution
- Add YAML frontmatter with author, date, copyright to all markdown files
- Visible copyright notice in each document (embedded in Word files)
- Create LICENSE.md with clear terms of use:
  • Unrestricted use within Curtin University
  • No external distribution without permission
  • Protects against unauthorized use by other institutions
- Update README with copyright notice and license reference
- Regenerate all Word documents with metadata

Protects intellectual property while allowing full institutional use.
</commit_message>
<xml_diff>
--- a/outputs/docx/1_README_Getting_Started.docx
+++ b/outputs/docx/1_README_Getting_Started.docx
@@ -2,6 +2,22 @@
 <file path=word/document.xml><?xml version="1.0" encoding="utf-8"?>
 <w:document xmlns:w="http://schemas.openxmlformats.org/wordprocessingml/2006/main" xmlns:m="http://schemas.openxmlformats.org/officeDocument/2006/math" xmlns:r="http://schemas.openxmlformats.org/officeDocument/2006/relationships" xmlns:o="urn:schemas-microsoft-com:office:office" xmlns:v="urn:schemas-microsoft-com:vml" xmlns:w10="urn:schemas-microsoft-com:office:word" xmlns:a="http://schemas.openxmlformats.org/drawingml/2006/main" xmlns:pic="http://schemas.openxmlformats.org/drawingml/2006/picture" xmlns:wp="http://schemas.openxmlformats.org/drawingml/2006/wordprocessingDrawing">
   <w:body>
+    <w:p>
+      <w:pPr>
+        <w:pStyle w:val="Author"/>
+      </w:pPr>
+      <w:r>
+        <w:t xml:space="preserve">Michael Borck, AI Facilitator, School of Management and Marketing, Curtin University</w:t>
+      </w:r>
+    </w:p>
+    <w:p>
+      <w:pPr>
+        <w:pStyle w:val="Date"/>
+      </w:pPr>
+      <w:r>
+        <w:t xml:space="preserve">February 2026</w:t>
+      </w:r>
+    </w:p>
     <w:bookmarkStart w:id="36" w:name="ai-integrated-assessment-rubric-suite"/>
     <w:p>
       <w:pPr>
@@ -18,6 +34,24 @@
       </w:pPr>
       <w:r>
         <w:t xml:space="preserve">For Curtin University A2030 Staff</w:t>
+      </w:r>
+    </w:p>
+    <w:p>
+      <w:pPr>
+        <w:pStyle w:val="BlockText"/>
+      </w:pPr>
+      <w:r>
+        <w:rPr>
+          <w:b/>
+          <w:bCs/>
+        </w:rPr>
+        <w:t xml:space="preserve">Copyright Notice:</w:t>
+      </w:r>
+      <w:r>
+        <w:t xml:space="preserve"> </w:t>
+      </w:r>
+      <w:r>
+        <w:t xml:space="preserve">This document and all materials in this suite are authored by Michael Borck (AI Facilitator, School of Management and Marketing, Curtin University). They are provided for use within Curtin University. External distribution, reproduction, or use outside Curtin University requires explicit written permission.</w:t>
       </w:r>
     </w:p>
     <w:p>

</xml_diff>